<commit_message>
Pengembalian paket Lisensi Atlas Family dan batas verifikasi 30 hari disetujui
- Engine: refundFamily mengembalikan paket utuh. Masa pertimbangan 10 hari
  kerja sejak pembelian paket (kursi aktif dipotong akses terpakai, harian
  dari Rp399.000/bulan) atau 7 hari kerja bila produk tidak sesuai (penuh).
  Semua komisi dan bonus paket ditarik; kursi belum verifikasi dihapus dan
  NIK dilepas (posisi dengan jaringan di bawahnya tetap tanpa data pribadi);
  anggota terverifikasi tetap Mitra PLS tanpa Lisensi.
- Kantor Maya: kotak pengembalian paket dengan rincian dana kembali per kursi
  dan status paket di daftar paket yang dijual.
- Dokumen: Rencana Pemasaran 5.6 dan Bab 13, Kode Etik Pasal 5, halaman
  Aturan, ringkasan, spesifikasi keputusan 21 (30 hari disetujui) dan 22.
- 4 uji baru (137 uji lulus).

Co-Authored-By: Claude Opus 5.5 <noreply@anthropic.com>
Claude-Session: https://claude.ai/code/session_01C9951NgictjxEvKqPLbNwt
</commit_message>
<xml_diff>
--- a/docs/dokumen-resmi/Kode_Etik_Mitra_PLS_Mitrans-Astra_v2.0_DRAF.docx
+++ b/docs/dokumen-resmi/Kode_Etik_Mitra_PLS_Mitrans-Astra_v2.0_DRAF.docx
@@ -974,6 +974,19 @@
       </w:pPr>
       <w:r>
         <w:t xml:space="preserve">Komisi dan bonus yang timbul dari pembelian yang dibatalkan ditarik kembali dari penerimanya.</w:t>
+      </w:r>
+    </w:p>
+    <w:p>
+      <w:pPr>
+        <w:pStyle w:val="ListParagraph"/>
+        <w:numPr>
+          <w:ilvl w:val="0"/>
+          <w:numId w:val="6"/>
+        </w:numPr>
+        <w:spacing w:after="60"/>
+      </w:pPr>
+      <w:r>
+        <w:t xml:space="preserve">Lisensi Atlas Family dikembalikan utuh per paket: dalam 10 hari kerja sejak pembelian paket dengan ketentuan angka 3, atau dalam 7 hari kerja dengan pengembalian penuh bila produk tidak sesuai yang diperjanjikan. Kursi yang belum diverifikasi dihapus dan NIK-nya dilepas.</w:t>
       </w:r>
     </w:p>
     <w:p>

</xml_diff>